<commit_message>
Fix live MySQL reject error, improve registration requests UI
</commit_message>
<xml_diff>
--- a/template/CONFIDENTIALITY AGREEMENT FOR OJT OFFICIAL_-A.docx
+++ b/template/CONFIDENTIALITY AGREEMENT FOR OJT OFFICIAL_-A.docx
@@ -1,6 +1,6 @@
 
 <file path=word/document.xml><?xml version="1.0" encoding="utf-8"?>
-<w:document xmlns:wpc="http://schemas.microsoft.com/office/word/2010/wordprocessingCanvas" xmlns:cx="http://schemas.microsoft.com/office/drawing/2014/chartex" xmlns:cx1="http://schemas.microsoft.com/office/drawing/2015/9/8/chartex" xmlns:cx2="http://schemas.microsoft.com/office/drawing/2015/10/21/chartex" xmlns:cx3="http://schemas.microsoft.com/office/drawing/2016/5/9/chartex" xmlns:cx4="http://schemas.microsoft.com/office/drawing/2016/5/10/chartex" xmlns:cx5="http://schemas.microsoft.com/office/drawing/2016/5/11/chartex" xmlns:cx6="http://schemas.microsoft.com/office/drawing/2016/5/12/chartex" xmlns:cx7="http://schemas.microsoft.com/office/drawing/2016/5/13/chartex" xmlns:cx8="http://schemas.microsoft.com/office/drawing/2016/5/14/chartex" xmlns:mc="http://schemas.openxmlformats.org/markup-compatibility/2006" xmlns:aink="http://schemas.microsoft.com/office/drawing/2016/ink" xmlns:am3d="http://schemas.microsoft.com/office/drawing/2017/model3d" xmlns:o="urn:schemas-microsoft-com:office:office" xmlns:oel="http://schemas.microsoft.com/office/2019/extlst" xmlns:r="http://schemas.openxmlformats.org/officeDocument/2006/relationships" xmlns:m="http://schemas.openxmlformats.org/officeDocument/2006/math" xmlns:v="urn:schemas-microsoft-com:vml" xmlns:wp14="http://schemas.microsoft.com/office/word/2010/wordprocessingDrawing" xmlns:wp="http://schemas.openxmlformats.org/drawingml/2006/wordprocessingDrawing" xmlns:w10="urn:schemas-microsoft-com:office:word" xmlns:w="http://schemas.openxmlformats.org/wordprocessingml/2006/main" xmlns:w14="http://schemas.microsoft.com/office/word/2010/wordml" xmlns:w15="http://schemas.microsoft.com/office/word/2012/wordml" xmlns:w16cex="http://schemas.microsoft.com/office/word/2018/wordml/cex" xmlns:w16cid="http://schemas.microsoft.com/office/word/2016/wordml/cid" xmlns:w16="http://schemas.microsoft.com/office/word/2018/wordml" xmlns:w16sdtdh="http://schemas.microsoft.com/office/word/2020/wordml/sdtdatahash" xmlns:w16se="http://schemas.microsoft.com/office/word/2015/wordml/symex" xmlns:wpg="http://schemas.microsoft.com/office/word/2010/wordprocessingGroup" xmlns:wpi="http://schemas.microsoft.com/office/word/2010/wordprocessingInk" xmlns:wne="http://schemas.microsoft.com/office/word/2006/wordml" xmlns:wps="http://schemas.microsoft.com/office/word/2010/wordprocessingShape" mc:Ignorable="w14 w15 w16se w16cid w16 w16cex w16sdtdh wp14">
+<w:document xmlns:wpc="http://schemas.microsoft.com/office/word/2010/wordprocessingCanvas" xmlns:mc="http://schemas.openxmlformats.org/markup-compatibility/2006" xmlns:o="urn:schemas-microsoft-com:office:office" xmlns:r="http://schemas.openxmlformats.org/officeDocument/2006/relationships" xmlns:m="http://schemas.openxmlformats.org/officeDocument/2006/math" xmlns:v="urn:schemas-microsoft-com:vml" xmlns:wp14="http://schemas.microsoft.com/office/word/2010/wordprocessingDrawing" xmlns:wp="http://schemas.openxmlformats.org/drawingml/2006/wordprocessingDrawing" xmlns:w10="urn:schemas-microsoft-com:office:word" xmlns:w="http://schemas.openxmlformats.org/wordprocessingml/2006/main" xmlns:w14="http://schemas.microsoft.com/office/word/2010/wordml" xmlns:w15="http://schemas.microsoft.com/office/word/2012/wordml" xmlns:wpg="http://schemas.microsoft.com/office/word/2010/wordprocessingGroup" xmlns:wpi="http://schemas.microsoft.com/office/word/2010/wordprocessingInk" xmlns:wne="http://schemas.microsoft.com/office/word/2006/wordml" xmlns:wps="http://schemas.microsoft.com/office/word/2010/wordprocessingShape" mc:Ignorable="w14 w15 wp14">
   <w:body>
     <w:p>
       <w:pPr>
@@ -17,9 +17,9 @@
         <w:tblLook w:val="04A0" w:firstRow="1" w:lastRow="0" w:firstColumn="1" w:lastColumn="0" w:noHBand="0" w:noVBand="1"/>
       </w:tblPr>
       <w:tblGrid>
-        <w:gridCol w:w="3116"/>
-        <w:gridCol w:w="3117"/>
-        <w:gridCol w:w="3117"/>
+        <w:gridCol w:w="3084"/>
+        <w:gridCol w:w="2971"/>
+        <w:gridCol w:w="2962"/>
       </w:tblGrid>
       <w:tr>
         <w:tc>
@@ -234,6 +234,22 @@
           <w:rFonts w:ascii="Cambria" w:hAnsi="Cambria"/>
         </w:rPr>
       </w:pPr>
+    </w:p>
+    <w:p>
+      <w:pPr>
+        <w:spacing w:after="0" w:line="240" w:lineRule="auto"/>
+        <w:rPr>
+          <w:rFonts w:ascii="Cambria" w:hAnsi="Cambria"/>
+        </w:rPr>
+      </w:pPr>
+    </w:p>
+    <w:p>
+      <w:pPr>
+        <w:spacing w:after="0" w:line="240" w:lineRule="auto"/>
+        <w:rPr>
+          <w:rFonts w:ascii="Cambria" w:hAnsi="Cambria"/>
+        </w:rPr>
+      </w:pPr>
       <w:r>
         <w:rPr>
           <w:rFonts w:ascii="Cambria" w:hAnsi="Cambria"/>
@@ -412,6 +428,16 @@
         </w:rPr>
         <w:t>I agree to adhere to and uphold the private and privileged information therein.</w:t>
       </w:r>
+    </w:p>
+    <w:p>
+      <w:pPr>
+        <w:pStyle w:val="ListParagraph"/>
+        <w:spacing w:after="0" w:line="240" w:lineRule="auto"/>
+        <w:jc w:val="both"/>
+        <w:rPr>
+          <w:rFonts w:ascii="Cambria" w:hAnsi="Cambria"/>
+        </w:rPr>
+      </w:pPr>
     </w:p>
     <w:p>
       <w:pPr>
@@ -446,8 +472,8 @@
         <w:tblLook w:val="04A0" w:firstRow="1" w:lastRow="0" w:firstColumn="1" w:lastColumn="0" w:noHBand="0" w:noVBand="1"/>
       </w:tblPr>
       <w:tblGrid>
-        <w:gridCol w:w="4675"/>
-        <w:gridCol w:w="4675"/>
+        <w:gridCol w:w="4523"/>
+        <w:gridCol w:w="4504"/>
       </w:tblGrid>
       <w:tr>
         <w:tc>
@@ -525,327 +551,23 @@
           </w:p>
         </w:tc>
       </w:tr>
-      <w:tr>
-        <w:tc>
-          <w:tcPr>
-            <w:tcW w:w="4675" w:type="dxa"/>
-          </w:tcPr>
-          <w:p>
-            <w:pPr>
-              <w:pBdr>
-                <w:bottom w:val="single" w:sz="12" w:space="1" w:color="auto"/>
-              </w:pBdr>
-              <w:jc w:val="both"/>
-              <w:rPr>
-                <w:rFonts w:ascii="Cambria" w:hAnsi="Cambria"/>
-              </w:rPr>
-            </w:pPr>
-          </w:p>
-          <w:p>
-            <w:pPr>
-              <w:pBdr>
-                <w:bottom w:val="single" w:sz="12" w:space="1" w:color="auto"/>
-              </w:pBdr>
-              <w:jc w:val="both"/>
-              <w:rPr>
-                <w:rFonts w:ascii="Cambria" w:hAnsi="Cambria"/>
-              </w:rPr>
-            </w:pPr>
-            <w:r>
-              <w:rPr>
-                <w:rFonts w:ascii="Cambria" w:hAnsi="Cambria"/>
-              </w:rPr>
-              <w:t>Noted by:</w:t>
-            </w:r>
-          </w:p>
-          <w:p>
-            <w:pPr>
-              <w:pBdr>
-                <w:bottom w:val="single" w:sz="12" w:space="1" w:color="auto"/>
-              </w:pBdr>
-              <w:jc w:val="both"/>
-              <w:rPr>
-                <w:rFonts w:ascii="Cambria" w:hAnsi="Cambria"/>
-              </w:rPr>
-            </w:pPr>
-          </w:p>
-          <w:p>
-            <w:pPr>
-              <w:jc w:val="center"/>
-              <w:rPr>
-                <w:rFonts w:ascii="Cambria" w:hAnsi="Cambria"/>
-              </w:rPr>
-            </w:pPr>
-            <w:r>
-              <w:rPr>
-                <w:rFonts w:ascii="Cambria" w:hAnsi="Cambria"/>
-              </w:rPr>
-              <w:t>Signature over Printed Name</w:t>
-            </w:r>
-          </w:p>
-          <w:p>
-            <w:pPr>
-              <w:jc w:val="center"/>
-              <w:rPr>
-                <w:rFonts w:ascii="Cambria" w:hAnsi="Cambria"/>
-              </w:rPr>
-            </w:pPr>
-            <w:r>
-              <w:rPr>
-                <w:rFonts w:ascii="Cambria" w:hAnsi="Cambria"/>
-              </w:rPr>
-              <w:t xml:space="preserve">OJT </w:t>
-            </w:r>
-            <w:r>
-              <w:rPr>
-                <w:rFonts w:ascii="Cambria" w:hAnsi="Cambria"/>
-              </w:rPr>
-              <w:t>Adviser</w:t>
-            </w:r>
-          </w:p>
-        </w:tc>
-        <w:tc>
-          <w:tcPr>
-            <w:tcW w:w="4675" w:type="dxa"/>
-          </w:tcPr>
-          <w:p>
-            <w:pPr>
-              <w:pBdr>
-                <w:bottom w:val="single" w:sz="12" w:space="1" w:color="auto"/>
-              </w:pBdr>
-              <w:jc w:val="both"/>
-              <w:rPr>
-                <w:rFonts w:ascii="Cambria" w:hAnsi="Cambria"/>
-              </w:rPr>
-            </w:pPr>
-          </w:p>
-          <w:p>
-            <w:pPr>
-              <w:pBdr>
-                <w:bottom w:val="single" w:sz="12" w:space="1" w:color="auto"/>
-              </w:pBdr>
-              <w:jc w:val="both"/>
-              <w:rPr>
-                <w:rFonts w:ascii="Cambria" w:hAnsi="Cambria"/>
-              </w:rPr>
-            </w:pPr>
-          </w:p>
-          <w:p>
-            <w:pPr>
-              <w:pBdr>
-                <w:bottom w:val="single" w:sz="12" w:space="1" w:color="auto"/>
-              </w:pBdr>
-              <w:jc w:val="both"/>
-              <w:rPr>
-                <w:rFonts w:ascii="Cambria" w:hAnsi="Cambria"/>
-              </w:rPr>
-            </w:pPr>
-          </w:p>
-          <w:p>
-            <w:pPr>
-              <w:jc w:val="center"/>
-              <w:rPr>
-                <w:rFonts w:ascii="Cambria" w:hAnsi="Cambria"/>
-              </w:rPr>
-            </w:pPr>
-            <w:r>
-              <w:rPr>
-                <w:rFonts w:ascii="Cambria" w:hAnsi="Cambria"/>
-              </w:rPr>
-              <w:t>Date</w:t>
-            </w:r>
-          </w:p>
-        </w:tc>
-      </w:tr>
-      <w:tr>
-        <w:tc>
-          <w:tcPr>
-            <w:tcW w:w="4675" w:type="dxa"/>
-          </w:tcPr>
-          <w:p>
-            <w:pPr>
-              <w:pBdr>
-                <w:bottom w:val="single" w:sz="12" w:space="1" w:color="auto"/>
-              </w:pBdr>
-              <w:jc w:val="both"/>
-              <w:rPr>
-                <w:rFonts w:ascii="Cambria" w:hAnsi="Cambria"/>
-              </w:rPr>
-            </w:pPr>
-          </w:p>
-          <w:p>
-            <w:pPr>
-              <w:pBdr>
-                <w:bottom w:val="single" w:sz="12" w:space="1" w:color="auto"/>
-              </w:pBdr>
-              <w:jc w:val="both"/>
-              <w:rPr>
-                <w:rFonts w:ascii="Cambria" w:hAnsi="Cambria"/>
-              </w:rPr>
-            </w:pPr>
-          </w:p>
-          <w:p>
-            <w:pPr>
-              <w:jc w:val="center"/>
-              <w:rPr>
-                <w:rFonts w:ascii="Cambria" w:hAnsi="Cambria"/>
-              </w:rPr>
-            </w:pPr>
-            <w:r>
-              <w:rPr>
-                <w:rFonts w:ascii="Cambria" w:hAnsi="Cambria"/>
-              </w:rPr>
-              <w:t>Signature over Printed Name</w:t>
-            </w:r>
-          </w:p>
-          <w:p>
-            <w:pPr>
-              <w:jc w:val="center"/>
-              <w:rPr>
-                <w:rFonts w:ascii="Cambria" w:hAnsi="Cambria"/>
-              </w:rPr>
-            </w:pPr>
-            <w:r>
-              <w:rPr>
-                <w:rFonts w:ascii="Cambria" w:hAnsi="Cambria"/>
-              </w:rPr>
-              <w:t>Training Supervisor</w:t>
-            </w:r>
-          </w:p>
-        </w:tc>
-        <w:tc>
-          <w:tcPr>
-            <w:tcW w:w="4675" w:type="dxa"/>
-          </w:tcPr>
-          <w:p>
-            <w:pPr>
-              <w:pBdr>
-                <w:bottom w:val="single" w:sz="12" w:space="1" w:color="auto"/>
-              </w:pBdr>
-              <w:jc w:val="both"/>
-              <w:rPr>
-                <w:rFonts w:ascii="Cambria" w:hAnsi="Cambria"/>
-              </w:rPr>
-            </w:pPr>
-          </w:p>
-          <w:p>
-            <w:pPr>
-              <w:pBdr>
-                <w:bottom w:val="single" w:sz="12" w:space="1" w:color="auto"/>
-              </w:pBdr>
-              <w:jc w:val="both"/>
-              <w:rPr>
-                <w:rFonts w:ascii="Cambria" w:hAnsi="Cambria"/>
-              </w:rPr>
-            </w:pPr>
-          </w:p>
-          <w:p>
-            <w:pPr>
-              <w:jc w:val="center"/>
-              <w:rPr>
-                <w:rFonts w:ascii="Cambria" w:hAnsi="Cambria"/>
-              </w:rPr>
-            </w:pPr>
-            <w:r>
-              <w:rPr>
-                <w:rFonts w:ascii="Cambria" w:hAnsi="Cambria"/>
-              </w:rPr>
-              <w:t>Date</w:t>
-            </w:r>
-          </w:p>
-        </w:tc>
-      </w:tr>
     </w:tbl>
     <w:p>
       <w:pPr>
         <w:spacing w:after="0" w:line="240" w:lineRule="auto"/>
-        <w:rPr>
-          <w:rFonts w:ascii="Cambria" w:hAnsi="Cambria"/>
-        </w:rPr>
-      </w:pPr>
-    </w:p>
-    <w:p>
-      <w:pPr>
-        <w:spacing w:after="0" w:line="240" w:lineRule="auto"/>
         <w:jc w:val="both"/>
         <w:rPr>
           <w:rFonts w:ascii="Cambria" w:hAnsi="Cambria"/>
           <w:i/>
-          <w:sz w:val="4"/>
-          <w:szCs w:val="4"/>
-        </w:rPr>
-      </w:pPr>
-      <w:r>
-        <w:rPr>
-          <w:rFonts w:ascii="Cambria" w:hAnsi="Cambria"/>
-        </w:rPr>
-        <w:t>Note:</w:t>
-      </w:r>
-      <w:r>
-        <w:rPr>
-          <w:rFonts w:ascii="Cambria" w:hAnsi="Cambria"/>
-        </w:rPr>
-        <w:tab/>
-      </w:r>
-      <w:r>
-        <w:rPr>
-          <w:rFonts w:ascii="Cambria" w:hAnsi="Cambria"/>
-          <w:i/>
-        </w:rPr>
-        <w:t xml:space="preserve">The trainee must sign this document in the presence of the </w:t>
-      </w:r>
-      <w:r>
-        <w:rPr>
-          <w:rFonts w:ascii="Cambria" w:hAnsi="Cambria"/>
-          <w:i/>
-        </w:rPr>
-        <w:t xml:space="preserve">OJT </w:t>
-      </w:r>
-      <w:r>
-        <w:rPr>
-          <w:rFonts w:ascii="Cambria" w:hAnsi="Cambria"/>
-          <w:i/>
-        </w:rPr>
-        <w:t xml:space="preserve">Adviser, Training </w:t>
-      </w:r>
-      <w:r>
-        <w:rPr>
-          <w:rFonts w:ascii="Cambria" w:hAnsi="Cambria"/>
-          <w:i/>
-        </w:rPr>
-        <w:tab/>
-        <w:t xml:space="preserve">Supervisor </w:t>
-      </w:r>
-    </w:p>
-    <w:p>
-      <w:pPr>
-        <w:spacing w:after="0" w:line="240" w:lineRule="auto"/>
-        <w:jc w:val="both"/>
-        <w:rPr>
-          <w:rFonts w:ascii="Cambria" w:hAnsi="Cambria"/>
-          <w:i/>
-        </w:rPr>
-      </w:pPr>
-      <w:r>
-        <w:rPr>
-          <w:rFonts w:ascii="Cambria" w:hAnsi="Cambria"/>
-          <w:i/>
-        </w:rPr>
-        <w:tab/>
-        <w:t>A copy of this agreement must be filed in the trainee’s OJT Program folder</w:t>
-      </w:r>
-      <w:r>
-        <w:rPr>
-          <w:rFonts w:ascii="Cambria" w:hAnsi="Cambria"/>
-          <w:i/>
-        </w:rPr>
-        <w:t>.</w:t>
-      </w:r>
+        </w:rPr>
+      </w:pPr>
+      <w:bookmarkStart w:id="0" w:name="_GoBack"/>
+      <w:bookmarkEnd w:id="0"/>
     </w:p>
     <w:sectPr>
       <w:headerReference w:type="default" r:id="rId7"/>
       <w:footerReference w:type="default" r:id="rId8"/>
-      <w:pgSz w:w="12240" w:h="15840"/>
+      <w:pgSz w:w="11907" w:h="16839" w:code="9"/>
       <w:pgMar w:top="1440" w:right="1440" w:bottom="1440" w:left="1440" w:header="720" w:footer="720" w:gutter="0"/>
       <w:cols w:space="720"/>
       <w:docGrid w:linePitch="360"/>
@@ -855,7 +577,7 @@
 </file>
 
 <file path=word/endnotes.xml><?xml version="1.0" encoding="utf-8"?>
-<w:endnotes xmlns:wpc="http://schemas.microsoft.com/office/word/2010/wordprocessingCanvas" xmlns:cx="http://schemas.microsoft.com/office/drawing/2014/chartex" xmlns:cx1="http://schemas.microsoft.com/office/drawing/2015/9/8/chartex" xmlns:cx2="http://schemas.microsoft.com/office/drawing/2015/10/21/chartex" xmlns:cx3="http://schemas.microsoft.com/office/drawing/2016/5/9/chartex" xmlns:cx4="http://schemas.microsoft.com/office/drawing/2016/5/10/chartex" xmlns:cx5="http://schemas.microsoft.com/office/drawing/2016/5/11/chartex" xmlns:cx6="http://schemas.microsoft.com/office/drawing/2016/5/12/chartex" xmlns:cx7="http://schemas.microsoft.com/office/drawing/2016/5/13/chartex" xmlns:cx8="http://schemas.microsoft.com/office/drawing/2016/5/14/chartex" xmlns:mc="http://schemas.openxmlformats.org/markup-compatibility/2006" xmlns:aink="http://schemas.microsoft.com/office/drawing/2016/ink" xmlns:am3d="http://schemas.microsoft.com/office/drawing/2017/model3d" xmlns:o="urn:schemas-microsoft-com:office:office" xmlns:oel="http://schemas.microsoft.com/office/2019/extlst" xmlns:r="http://schemas.openxmlformats.org/officeDocument/2006/relationships" xmlns:m="http://schemas.openxmlformats.org/officeDocument/2006/math" xmlns:v="urn:schemas-microsoft-com:vml" xmlns:wp14="http://schemas.microsoft.com/office/word/2010/wordprocessingDrawing" xmlns:wp="http://schemas.openxmlformats.org/drawingml/2006/wordprocessingDrawing" xmlns:w10="urn:schemas-microsoft-com:office:word" xmlns:w="http://schemas.openxmlformats.org/wordprocessingml/2006/main" xmlns:w14="http://schemas.microsoft.com/office/word/2010/wordml" xmlns:w15="http://schemas.microsoft.com/office/word/2012/wordml" xmlns:w16cex="http://schemas.microsoft.com/office/word/2018/wordml/cex" xmlns:w16cid="http://schemas.microsoft.com/office/word/2016/wordml/cid" xmlns:w16="http://schemas.microsoft.com/office/word/2018/wordml" xmlns:w16sdtdh="http://schemas.microsoft.com/office/word/2020/wordml/sdtdatahash" xmlns:w16se="http://schemas.microsoft.com/office/word/2015/wordml/symex" xmlns:wpg="http://schemas.microsoft.com/office/word/2010/wordprocessingGroup" xmlns:wpi="http://schemas.microsoft.com/office/word/2010/wordprocessingInk" xmlns:wne="http://schemas.microsoft.com/office/word/2006/wordml" xmlns:wps="http://schemas.microsoft.com/office/word/2010/wordprocessingShape" mc:Ignorable="w14 w15 w16se w16cid w16 w16cex w16sdtdh wp14">
+<w:endnotes xmlns:wpc="http://schemas.microsoft.com/office/word/2010/wordprocessingCanvas" xmlns:mc="http://schemas.openxmlformats.org/markup-compatibility/2006" xmlns:o="urn:schemas-microsoft-com:office:office" xmlns:r="http://schemas.openxmlformats.org/officeDocument/2006/relationships" xmlns:m="http://schemas.openxmlformats.org/officeDocument/2006/math" xmlns:v="urn:schemas-microsoft-com:vml" xmlns:wp14="http://schemas.microsoft.com/office/word/2010/wordprocessingDrawing" xmlns:wp="http://schemas.openxmlformats.org/drawingml/2006/wordprocessingDrawing" xmlns:w10="urn:schemas-microsoft-com:office:word" xmlns:w="http://schemas.openxmlformats.org/wordprocessingml/2006/main" xmlns:w14="http://schemas.microsoft.com/office/word/2010/wordml" xmlns:w15="http://schemas.microsoft.com/office/word/2012/wordml" xmlns:wpg="http://schemas.microsoft.com/office/word/2010/wordprocessingGroup" xmlns:wpi="http://schemas.microsoft.com/office/word/2010/wordprocessingInk" xmlns:wne="http://schemas.microsoft.com/office/word/2006/wordml" xmlns:wps="http://schemas.microsoft.com/office/word/2010/wordprocessingShape" mc:Ignorable="w14 w15 wp14">
   <w:endnote w:type="separator" w:id="-1">
     <w:p>
       <w:pPr>
@@ -880,7 +602,7 @@
 </file>
 
 <file path=word/footer1.xml><?xml version="1.0" encoding="utf-8"?>
-<w:ftr xmlns:wpc="http://schemas.microsoft.com/office/word/2010/wordprocessingCanvas" xmlns:cx="http://schemas.microsoft.com/office/drawing/2014/chartex" xmlns:cx1="http://schemas.microsoft.com/office/drawing/2015/9/8/chartex" xmlns:cx2="http://schemas.microsoft.com/office/drawing/2015/10/21/chartex" xmlns:cx3="http://schemas.microsoft.com/office/drawing/2016/5/9/chartex" xmlns:cx4="http://schemas.microsoft.com/office/drawing/2016/5/10/chartex" xmlns:cx5="http://schemas.microsoft.com/office/drawing/2016/5/11/chartex" xmlns:cx6="http://schemas.microsoft.com/office/drawing/2016/5/12/chartex" xmlns:cx7="http://schemas.microsoft.com/office/drawing/2016/5/13/chartex" xmlns:cx8="http://schemas.microsoft.com/office/drawing/2016/5/14/chartex" xmlns:mc="http://schemas.openxmlformats.org/markup-compatibility/2006" xmlns:aink="http://schemas.microsoft.com/office/drawing/2016/ink" xmlns:am3d="http://schemas.microsoft.com/office/drawing/2017/model3d" xmlns:o="urn:schemas-microsoft-com:office:office" xmlns:oel="http://schemas.microsoft.com/office/2019/extlst" xmlns:r="http://schemas.openxmlformats.org/officeDocument/2006/relationships" xmlns:m="http://schemas.openxmlformats.org/officeDocument/2006/math" xmlns:v="urn:schemas-microsoft-com:vml" xmlns:wp14="http://schemas.microsoft.com/office/word/2010/wordprocessingDrawing" xmlns:wp="http://schemas.openxmlformats.org/drawingml/2006/wordprocessingDrawing" xmlns:w10="urn:schemas-microsoft-com:office:word" xmlns:w="http://schemas.openxmlformats.org/wordprocessingml/2006/main" xmlns:w14="http://schemas.microsoft.com/office/word/2010/wordml" xmlns:w15="http://schemas.microsoft.com/office/word/2012/wordml" xmlns:w16cex="http://schemas.microsoft.com/office/word/2018/wordml/cex" xmlns:w16cid="http://schemas.microsoft.com/office/word/2016/wordml/cid" xmlns:w16="http://schemas.microsoft.com/office/word/2018/wordml" xmlns:w16sdtdh="http://schemas.microsoft.com/office/word/2020/wordml/sdtdatahash" xmlns:w16se="http://schemas.microsoft.com/office/word/2015/wordml/symex" xmlns:wpg="http://schemas.microsoft.com/office/word/2010/wordprocessingGroup" xmlns:wpi="http://schemas.microsoft.com/office/word/2010/wordprocessingInk" xmlns:wne="http://schemas.microsoft.com/office/word/2006/wordml" xmlns:wps="http://schemas.microsoft.com/office/word/2010/wordprocessingShape" mc:Ignorable="w14 w15 w16se w16cid w16 w16cex w16sdtdh wp14">
+<w:ftr xmlns:wpc="http://schemas.microsoft.com/office/word/2010/wordprocessingCanvas" xmlns:mc="http://schemas.openxmlformats.org/markup-compatibility/2006" xmlns:o="urn:schemas-microsoft-com:office:office" xmlns:r="http://schemas.openxmlformats.org/officeDocument/2006/relationships" xmlns:m="http://schemas.openxmlformats.org/officeDocument/2006/math" xmlns:v="urn:schemas-microsoft-com:vml" xmlns:wp14="http://schemas.microsoft.com/office/word/2010/wordprocessingDrawing" xmlns:wp="http://schemas.openxmlformats.org/drawingml/2006/wordprocessingDrawing" xmlns:w10="urn:schemas-microsoft-com:office:word" xmlns:w="http://schemas.openxmlformats.org/wordprocessingml/2006/main" xmlns:w14="http://schemas.microsoft.com/office/word/2010/wordml" xmlns:w15="http://schemas.microsoft.com/office/word/2012/wordml" xmlns:wpg="http://schemas.microsoft.com/office/word/2010/wordprocessingGroup" xmlns:wpi="http://schemas.microsoft.com/office/word/2010/wordprocessingInk" xmlns:wne="http://schemas.microsoft.com/office/word/2006/wordml" xmlns:wps="http://schemas.microsoft.com/office/word/2010/wordprocessingShape" mc:Ignorable="w14 w15 wp14">
   <w:p>
     <w:pPr>
       <w:pStyle w:val="Footer"/>
@@ -921,7 +643,7 @@
 </file>
 
 <file path=word/footnotes.xml><?xml version="1.0" encoding="utf-8"?>
-<w:footnotes xmlns:wpc="http://schemas.microsoft.com/office/word/2010/wordprocessingCanvas" xmlns:cx="http://schemas.microsoft.com/office/drawing/2014/chartex" xmlns:cx1="http://schemas.microsoft.com/office/drawing/2015/9/8/chartex" xmlns:cx2="http://schemas.microsoft.com/office/drawing/2015/10/21/chartex" xmlns:cx3="http://schemas.microsoft.com/office/drawing/2016/5/9/chartex" xmlns:cx4="http://schemas.microsoft.com/office/drawing/2016/5/10/chartex" xmlns:cx5="http://schemas.microsoft.com/office/drawing/2016/5/11/chartex" xmlns:cx6="http://schemas.microsoft.com/office/drawing/2016/5/12/chartex" xmlns:cx7="http://schemas.microsoft.com/office/drawing/2016/5/13/chartex" xmlns:cx8="http://schemas.microsoft.com/office/drawing/2016/5/14/chartex" xmlns:mc="http://schemas.openxmlformats.org/markup-compatibility/2006" xmlns:aink="http://schemas.microsoft.com/office/drawing/2016/ink" xmlns:am3d="http://schemas.microsoft.com/office/drawing/2017/model3d" xmlns:o="urn:schemas-microsoft-com:office:office" xmlns:oel="http://schemas.microsoft.com/office/2019/extlst" xmlns:r="http://schemas.openxmlformats.org/officeDocument/2006/relationships" xmlns:m="http://schemas.openxmlformats.org/officeDocument/2006/math" xmlns:v="urn:schemas-microsoft-com:vml" xmlns:wp14="http://schemas.microsoft.com/office/word/2010/wordprocessingDrawing" xmlns:wp="http://schemas.openxmlformats.org/drawingml/2006/wordprocessingDrawing" xmlns:w10="urn:schemas-microsoft-com:office:word" xmlns:w="http://schemas.openxmlformats.org/wordprocessingml/2006/main" xmlns:w14="http://schemas.microsoft.com/office/word/2010/wordml" xmlns:w15="http://schemas.microsoft.com/office/word/2012/wordml" xmlns:w16cex="http://schemas.microsoft.com/office/word/2018/wordml/cex" xmlns:w16cid="http://schemas.microsoft.com/office/word/2016/wordml/cid" xmlns:w16="http://schemas.microsoft.com/office/word/2018/wordml" xmlns:w16sdtdh="http://schemas.microsoft.com/office/word/2020/wordml/sdtdatahash" xmlns:w16se="http://schemas.microsoft.com/office/word/2015/wordml/symex" xmlns:wpg="http://schemas.microsoft.com/office/word/2010/wordprocessingGroup" xmlns:wpi="http://schemas.microsoft.com/office/word/2010/wordprocessingInk" xmlns:wne="http://schemas.microsoft.com/office/word/2006/wordml" xmlns:wps="http://schemas.microsoft.com/office/word/2010/wordprocessingShape" mc:Ignorable="w14 w15 w16se w16cid w16 w16cex w16sdtdh wp14">
+<w:footnotes xmlns:wpc="http://schemas.microsoft.com/office/word/2010/wordprocessingCanvas" xmlns:mc="http://schemas.openxmlformats.org/markup-compatibility/2006" xmlns:o="urn:schemas-microsoft-com:office:office" xmlns:r="http://schemas.openxmlformats.org/officeDocument/2006/relationships" xmlns:m="http://schemas.openxmlformats.org/officeDocument/2006/math" xmlns:v="urn:schemas-microsoft-com:vml" xmlns:wp14="http://schemas.microsoft.com/office/word/2010/wordprocessingDrawing" xmlns:wp="http://schemas.openxmlformats.org/drawingml/2006/wordprocessingDrawing" xmlns:w10="urn:schemas-microsoft-com:office:word" xmlns:w="http://schemas.openxmlformats.org/wordprocessingml/2006/main" xmlns:w14="http://schemas.microsoft.com/office/word/2010/wordml" xmlns:w15="http://schemas.microsoft.com/office/word/2012/wordml" xmlns:wpg="http://schemas.microsoft.com/office/word/2010/wordprocessingGroup" xmlns:wpi="http://schemas.microsoft.com/office/word/2010/wordprocessingInk" xmlns:wne="http://schemas.microsoft.com/office/word/2006/wordml" xmlns:wps="http://schemas.microsoft.com/office/word/2010/wordprocessingShape" mc:Ignorable="w14 w15 wp14">
   <w:footnote w:type="separator" w:id="-1">
     <w:p>
       <w:pPr>
@@ -946,7 +668,7 @@
 </file>
 
 <file path=word/header1.xml><?xml version="1.0" encoding="utf-8"?>
-<w:hdr xmlns:wpc="http://schemas.microsoft.com/office/word/2010/wordprocessingCanvas" xmlns:cx="http://schemas.microsoft.com/office/drawing/2014/chartex" xmlns:cx1="http://schemas.microsoft.com/office/drawing/2015/9/8/chartex" xmlns:cx2="http://schemas.microsoft.com/office/drawing/2015/10/21/chartex" xmlns:cx3="http://schemas.microsoft.com/office/drawing/2016/5/9/chartex" xmlns:cx4="http://schemas.microsoft.com/office/drawing/2016/5/10/chartex" xmlns:cx5="http://schemas.microsoft.com/office/drawing/2016/5/11/chartex" xmlns:cx6="http://schemas.microsoft.com/office/drawing/2016/5/12/chartex" xmlns:cx7="http://schemas.microsoft.com/office/drawing/2016/5/13/chartex" xmlns:cx8="http://schemas.microsoft.com/office/drawing/2016/5/14/chartex" xmlns:mc="http://schemas.openxmlformats.org/markup-compatibility/2006" xmlns:aink="http://schemas.microsoft.com/office/drawing/2016/ink" xmlns:am3d="http://schemas.microsoft.com/office/drawing/2017/model3d" xmlns:o="urn:schemas-microsoft-com:office:office" xmlns:oel="http://schemas.microsoft.com/office/2019/extlst" xmlns:r="http://schemas.openxmlformats.org/officeDocument/2006/relationships" xmlns:m="http://schemas.openxmlformats.org/officeDocument/2006/math" xmlns:v="urn:schemas-microsoft-com:vml" xmlns:wp14="http://schemas.microsoft.com/office/word/2010/wordprocessingDrawing" xmlns:wp="http://schemas.openxmlformats.org/drawingml/2006/wordprocessingDrawing" xmlns:w10="urn:schemas-microsoft-com:office:word" xmlns:w="http://schemas.openxmlformats.org/wordprocessingml/2006/main" xmlns:w14="http://schemas.microsoft.com/office/word/2010/wordml" xmlns:w15="http://schemas.microsoft.com/office/word/2012/wordml" xmlns:w16cex="http://schemas.microsoft.com/office/word/2018/wordml/cex" xmlns:w16cid="http://schemas.microsoft.com/office/word/2016/wordml/cid" xmlns:w16="http://schemas.microsoft.com/office/word/2018/wordml" xmlns:w16sdtdh="http://schemas.microsoft.com/office/word/2020/wordml/sdtdatahash" xmlns:w16se="http://schemas.microsoft.com/office/word/2015/wordml/symex" xmlns:wpg="http://schemas.microsoft.com/office/word/2010/wordprocessingGroup" xmlns:wpi="http://schemas.microsoft.com/office/word/2010/wordprocessingInk" xmlns:wne="http://schemas.microsoft.com/office/word/2006/wordml" xmlns:wps="http://schemas.microsoft.com/office/word/2010/wordprocessingShape" mc:Ignorable="w14 w15 w16se w16cid w16 w16cex w16sdtdh wp14">
+<w:hdr xmlns:wpc="http://schemas.microsoft.com/office/word/2010/wordprocessingCanvas" xmlns:mc="http://schemas.openxmlformats.org/markup-compatibility/2006" xmlns:o="urn:schemas-microsoft-com:office:office" xmlns:r="http://schemas.openxmlformats.org/officeDocument/2006/relationships" xmlns:m="http://schemas.openxmlformats.org/officeDocument/2006/math" xmlns:v="urn:schemas-microsoft-com:vml" xmlns:wp14="http://schemas.microsoft.com/office/word/2010/wordprocessingDrawing" xmlns:wp="http://schemas.openxmlformats.org/drawingml/2006/wordprocessingDrawing" xmlns:w10="urn:schemas-microsoft-com:office:word" xmlns:w="http://schemas.openxmlformats.org/wordprocessingml/2006/main" xmlns:w14="http://schemas.microsoft.com/office/word/2010/wordml" xmlns:w15="http://schemas.microsoft.com/office/word/2012/wordml" xmlns:wpg="http://schemas.microsoft.com/office/word/2010/wordprocessingGroup" xmlns:wpi="http://schemas.microsoft.com/office/word/2010/wordprocessingInk" xmlns:wne="http://schemas.microsoft.com/office/word/2006/wordml" xmlns:wps="http://schemas.microsoft.com/office/word/2010/wordprocessingShape" mc:Ignorable="w14 w15 wp14">
   <w:p>
     <w:pPr>
       <w:spacing w:after="0" w:line="240" w:lineRule="auto"/>
@@ -1054,7 +776,7 @@
 </file>
 
 <file path=word/numbering.xml><?xml version="1.0" encoding="utf-8"?>
-<w:numbering xmlns:wpc="http://schemas.microsoft.com/office/word/2010/wordprocessingCanvas" xmlns:cx="http://schemas.microsoft.com/office/drawing/2014/chartex" xmlns:cx1="http://schemas.microsoft.com/office/drawing/2015/9/8/chartex" xmlns:cx2="http://schemas.microsoft.com/office/drawing/2015/10/21/chartex" xmlns:cx3="http://schemas.microsoft.com/office/drawing/2016/5/9/chartex" xmlns:cx4="http://schemas.microsoft.com/office/drawing/2016/5/10/chartex" xmlns:cx5="http://schemas.microsoft.com/office/drawing/2016/5/11/chartex" xmlns:cx6="http://schemas.microsoft.com/office/drawing/2016/5/12/chartex" xmlns:cx7="http://schemas.microsoft.com/office/drawing/2016/5/13/chartex" xmlns:cx8="http://schemas.microsoft.com/office/drawing/2016/5/14/chartex" xmlns:mc="http://schemas.openxmlformats.org/markup-compatibility/2006" xmlns:aink="http://schemas.microsoft.com/office/drawing/2016/ink" xmlns:am3d="http://schemas.microsoft.com/office/drawing/2017/model3d" xmlns:o="urn:schemas-microsoft-com:office:office" xmlns:oel="http://schemas.microsoft.com/office/2019/extlst" xmlns:r="http://schemas.openxmlformats.org/officeDocument/2006/relationships" xmlns:m="http://schemas.openxmlformats.org/officeDocument/2006/math" xmlns:v="urn:schemas-microsoft-com:vml" xmlns:wp14="http://schemas.microsoft.com/office/word/2010/wordprocessingDrawing" xmlns:wp="http://schemas.openxmlformats.org/drawingml/2006/wordprocessingDrawing" xmlns:w10="urn:schemas-microsoft-com:office:word" xmlns:w="http://schemas.openxmlformats.org/wordprocessingml/2006/main" xmlns:w14="http://schemas.microsoft.com/office/word/2010/wordml" xmlns:w15="http://schemas.microsoft.com/office/word/2012/wordml" xmlns:w16cex="http://schemas.microsoft.com/office/word/2018/wordml/cex" xmlns:w16cid="http://schemas.microsoft.com/office/word/2016/wordml/cid" xmlns:w16="http://schemas.microsoft.com/office/word/2018/wordml" xmlns:w16sdtdh="http://schemas.microsoft.com/office/word/2020/wordml/sdtdatahash" xmlns:w16se="http://schemas.microsoft.com/office/word/2015/wordml/symex" xmlns:wpg="http://schemas.microsoft.com/office/word/2010/wordprocessingGroup" xmlns:wpi="http://schemas.microsoft.com/office/word/2010/wordprocessingInk" xmlns:wne="http://schemas.microsoft.com/office/word/2006/wordml" xmlns:wps="http://schemas.microsoft.com/office/word/2010/wordprocessingShape" mc:Ignorable="w14 w15 w16se w16cid w16 w16cex w16sdtdh wp14">
+<w:numbering xmlns:wpc="http://schemas.microsoft.com/office/word/2010/wordprocessingCanvas" xmlns:mc="http://schemas.openxmlformats.org/markup-compatibility/2006" xmlns:o="urn:schemas-microsoft-com:office:office" xmlns:r="http://schemas.openxmlformats.org/officeDocument/2006/relationships" xmlns:m="http://schemas.openxmlformats.org/officeDocument/2006/math" xmlns:v="urn:schemas-microsoft-com:vml" xmlns:wp14="http://schemas.microsoft.com/office/word/2010/wordprocessingDrawing" xmlns:wp="http://schemas.openxmlformats.org/drawingml/2006/wordprocessingDrawing" xmlns:w10="urn:schemas-microsoft-com:office:word" xmlns:w="http://schemas.openxmlformats.org/wordprocessingml/2006/main" xmlns:w14="http://schemas.microsoft.com/office/word/2010/wordml" xmlns:w15="http://schemas.microsoft.com/office/word/2012/wordml" xmlns:wpg="http://schemas.microsoft.com/office/word/2010/wordprocessingGroup" xmlns:wpi="http://schemas.microsoft.com/office/word/2010/wordprocessingInk" xmlns:wne="http://schemas.microsoft.com/office/word/2006/wordml" xmlns:wps="http://schemas.microsoft.com/office/word/2010/wordprocessingShape" mc:Ignorable="w14 w15 wp14">
   <w:abstractNum w:abstractNumId="0" w15:restartNumberingAfterBreak="0">
     <w:nsid w:val="7CF35488"/>
     <w:multiLevelType w:val="hybridMultilevel"/>
@@ -1168,14 +890,14 @@
       </w:rPr>
     </w:lvl>
   </w:abstractNum>
-  <w:num w:numId="1" w16cid:durableId="1471557667">
+  <w:num w:numId="1">
     <w:abstractNumId w:val="0"/>
   </w:num>
 </w:numbering>
 </file>
 
 <file path=word/styles.xml><?xml version="1.0" encoding="utf-8"?>
-<w:styles xmlns:mc="http://schemas.openxmlformats.org/markup-compatibility/2006" xmlns:r="http://schemas.openxmlformats.org/officeDocument/2006/relationships" xmlns:w="http://schemas.openxmlformats.org/wordprocessingml/2006/main" xmlns:w14="http://schemas.microsoft.com/office/word/2010/wordml" xmlns:w15="http://schemas.microsoft.com/office/word/2012/wordml" xmlns:w16cex="http://schemas.microsoft.com/office/word/2018/wordml/cex" xmlns:w16cid="http://schemas.microsoft.com/office/word/2016/wordml/cid" xmlns:w16="http://schemas.microsoft.com/office/word/2018/wordml" xmlns:w16sdtdh="http://schemas.microsoft.com/office/word/2020/wordml/sdtdatahash" xmlns:w16se="http://schemas.microsoft.com/office/word/2015/wordml/symex" mc:Ignorable="w14 w15 w16se w16cid w16 w16cex w16sdtdh">
+<w:styles xmlns:mc="http://schemas.openxmlformats.org/markup-compatibility/2006" xmlns:r="http://schemas.openxmlformats.org/officeDocument/2006/relationships" xmlns:w="http://schemas.openxmlformats.org/wordprocessingml/2006/main" xmlns:w14="http://schemas.microsoft.com/office/word/2010/wordml" xmlns:w15="http://schemas.microsoft.com/office/word/2012/wordml" mc:Ignorable="w14 w15">
   <w:docDefaults>
     <w:rPrDefault>
       <w:rPr>
@@ -1191,7 +913,7 @@
       </w:pPr>
     </w:pPrDefault>
   </w:docDefaults>
-  <w:latentStyles w:defLockedState="0" w:defUIPriority="99" w:defSemiHidden="0" w:defUnhideWhenUsed="0" w:defQFormat="0" w:count="376">
+  <w:latentStyles w:defLockedState="0" w:defUIPriority="99" w:defSemiHidden="0" w:defUnhideWhenUsed="0" w:defQFormat="0" w:count="371">
     <w:lsdException w:name="Normal" w:uiPriority="0" w:qFormat="1"/>
     <w:lsdException w:name="heading 1" w:uiPriority="9" w:qFormat="1"/>
     <w:lsdException w:name="heading 2" w:semiHidden="1" w:uiPriority="9" w:unhideWhenUsed="1" w:qFormat="1"/>
@@ -1563,11 +1285,6 @@
     <w:lsdException w:name="List Table 5 Dark Accent 6" w:uiPriority="50"/>
     <w:lsdException w:name="List Table 6 Colorful Accent 6" w:uiPriority="51"/>
     <w:lsdException w:name="List Table 7 Colorful Accent 6" w:uiPriority="52"/>
-    <w:lsdException w:name="Mention" w:semiHidden="1" w:unhideWhenUsed="1"/>
-    <w:lsdException w:name="Smart Hyperlink" w:semiHidden="1" w:unhideWhenUsed="1"/>
-    <w:lsdException w:name="Hashtag" w:semiHidden="1" w:unhideWhenUsed="1"/>
-    <w:lsdException w:name="Unresolved Mention" w:semiHidden="1" w:unhideWhenUsed="1"/>
-    <w:lsdException w:name="Smart Link" w:semiHidden="1" w:unhideWhenUsed="1"/>
   </w:latentStyles>
   <w:style w:type="paragraph" w:default="1" w:styleId="Normal">
     <w:name w:val="Normal"/>

</xml_diff>